<commit_message>
docs(no-show): add the exact risk-score calculation + an edge-cases section
- Section 03 now shows how the score is worked out — the additive rule
  (1 − reliability, +0.15 new, +0.10 imminent, +0.05 weekend, clamp, bands)
  with three worked examples (Meena 5%, new pro 58%, unproven 80%).
- New section 09 "Edge cases": the timing/lead-time problem (decide before
  the slot so the backup arrives on time), no backup free, primary shows
  after dispatch, unpredicted no-show, double failure, too-soon bookings,
  brand-new worker. Plain language, diagrams retained.
</commit_message>
<xml_diff>
--- a/docs/Casai-No-Show-Heuristic-to-Model.docx
+++ b/docs/Casai-No-Show-Heuristic-to-Model.docx
@@ -887,6 +887,730 @@
         </w:tc>
       </w:tr>
     </w:tbl>
+    <w:p>
+      <w:pPr>
+        <w:pStyle w:val="Heading3"/>
+        <w:spacing w:after="60" w:before="220"/>
+      </w:pPr>
+      <w:r>
+        <w:rPr>
+          <w:rFonts w:ascii="Calibri" w:cs="Calibri" w:eastAsia="Calibri" w:hAnsi="Calibri"/>
+          <w:b/>
+          <w:bCs/>
+          <w:color w:val="0F6E56"/>
+          <w:sz w:val="21"/>
+          <w:szCs w:val="21"/>
+        </w:rPr>
+        <w:t xml:space="preserve">How the score is actually worked out</w:t>
+      </w:r>
+    </w:p>
+    <w:p>
+      <w:pPr>
+        <w:spacing w:after="120" w:line="276"/>
+      </w:pPr>
+      <w:r>
+        <w:rPr>
+          <w:rFonts w:ascii="Calibri" w:cs="Calibri" w:eastAsia="Calibri" w:hAnsi="Calibri"/>
+          <w:color w:val="2B3A34"/>
+          <w:sz w:val="21"/>
+          <w:szCs w:val="21"/>
+        </w:rPr>
+        <w:t xml:space="preserve">Concretely: start from how reliable the worker is, add a little for each risk factor, then keep the result sensible. Every number comes from the worker's own record and the slot — nothing invented.</w:t>
+      </w:r>
+    </w:p>
+    <w:tbl>
+      <w:tblPr>
+        <w:tblW w:type="dxa" w:w="9360"/>
+        <w:tblBorders>
+          <w:top w:val="none"/>
+          <w:left w:val="single" w:color="0F6E56" w:sz="14"/>
+          <w:bottom w:val="none"/>
+          <w:right w:val="none"/>
+          <w:insideH w:val="none"/>
+          <w:insideV w:val="none"/>
+        </w:tblBorders>
+      </w:tblPr>
+      <w:tblGrid>
+        <w:gridCol w:w="9360"/>
+      </w:tblGrid>
+      <w:tr>
+        <w:tc>
+          <w:tcPr>
+            <w:tcW w:type="dxa" w:w="9360"/>
+            <w:shd w:fill="EEF3F1" w:val="clear"/>
+            <w:tcMar>
+              <w:top w:type="dxa" w:w="80"/>
+              <w:left w:type="dxa" w:w="180"/>
+              <w:bottom w:type="dxa" w:w="80"/>
+              <w:right w:type="dxa" w:w="140"/>
+            </w:tcMar>
+          </w:tcPr>
+          <w:p>
+            <w:pPr>
+              <w:spacing w:after="22"/>
+            </w:pPr>
+            <w:r>
+              <w:rPr>
+                <w:rFonts w:ascii="Consolas" w:cs="Consolas" w:eastAsia="Consolas" w:hAnsi="Consolas"/>
+                <w:color w:val="0E3D33"/>
+                <w:sz w:val="18"/>
+                <w:szCs w:val="18"/>
+              </w:rPr>
+              <w:t xml:space="preserve">Start:  1 − reliability            (unknown worker → 0.35)</w:t>
+            </w:r>
+          </w:p>
+          <w:p>
+            <w:pPr>
+              <w:spacing w:after="22"/>
+            </w:pPr>
+            <w:r>
+              <w:rPr>
+                <w:rFonts w:ascii="Consolas" w:cs="Consolas" w:eastAsia="Consolas" w:hAnsi="Consolas"/>
+                <w:color w:val="0E3D33"/>
+                <w:sz w:val="18"/>
+                <w:szCs w:val="18"/>
+              </w:rPr>
+              <w:t xml:space="preserve">Add:    + 0.15   if under 20 jobs done</w:t>
+            </w:r>
+          </w:p>
+          <w:p>
+            <w:pPr>
+              <w:spacing w:after="22"/>
+            </w:pPr>
+            <w:r>
+              <w:rPr>
+                <w:rFonts w:ascii="Consolas" w:cs="Consolas" w:eastAsia="Consolas" w:hAnsi="Consolas"/>
+                <w:color w:val="0E3D33"/>
+                <w:sz w:val="18"/>
+                <w:szCs w:val="18"/>
+              </w:rPr>
+              <w:t xml:space="preserve">Add:    + 0.10   if the slot is &lt; 3 hours away</w:t>
+            </w:r>
+          </w:p>
+          <w:p>
+            <w:pPr>
+              <w:spacing w:after="22"/>
+            </w:pPr>
+            <w:r>
+              <w:rPr>
+                <w:rFonts w:ascii="Consolas" w:cs="Consolas" w:eastAsia="Consolas" w:hAnsi="Consolas"/>
+                <w:color w:val="0E3D33"/>
+                <w:sz w:val="18"/>
+                <w:szCs w:val="18"/>
+              </w:rPr>
+              <w:t xml:space="preserve">Add:    + 0.05   if it is a weekend</w:t>
+            </w:r>
+          </w:p>
+          <w:p>
+            <w:pPr>
+              <w:spacing w:after="22"/>
+            </w:pPr>
+            <w:r>
+              <w:rPr>
+                <w:rFonts w:ascii="Consolas" w:cs="Consolas" w:eastAsia="Consolas" w:hAnsi="Consolas"/>
+                <w:color w:val="0E3D33"/>
+                <w:sz w:val="18"/>
+                <w:szCs w:val="18"/>
+              </w:rPr>
+              <w:t xml:space="preserve">Keep the result between 5% and 95%.</w:t>
+            </w:r>
+          </w:p>
+          <w:p>
+            <w:pPr>
+              <w:spacing w:after="22"/>
+            </w:pPr>
+            <w:r>
+              <w:rPr>
+                <w:rFonts w:ascii="Consolas" w:cs="Consolas" w:eastAsia="Consolas" w:hAnsi="Consolas"/>
+                <w:color w:val="0E3D33"/>
+                <w:sz w:val="18"/>
+                <w:szCs w:val="18"/>
+              </w:rPr>
+              <w:t xml:space="preserve">Label:  High &gt; 70%   ·   Medium ≥ 25%   ·   Low otherwise</w:t>
+            </w:r>
+          </w:p>
+        </w:tc>
+      </w:tr>
+    </w:tbl>
+    <w:p>
+      <w:pPr>
+        <w:spacing w:after="120" w:line="276"/>
+      </w:pPr>
+      <w:r>
+        <w:rPr>
+          <w:rFonts w:ascii="Calibri" w:cs="Calibri" w:eastAsia="Calibri" w:hAnsi="Calibri"/>
+          <w:color w:val="2B3A34"/>
+          <w:sz w:val="21"/>
+          <w:szCs w:val="21"/>
+        </w:rPr>
+        <w:t xml:space="preserve">Worked through on three real cases:</w:t>
+      </w:r>
+    </w:p>
+    <w:tbl>
+      <w:tblPr>
+        <w:tblW w:type="dxa" w:w="9360"/>
+        <w:tblBorders>
+          <w:top w:val="single" w:color="D9DEDB" w:sz="2"/>
+          <w:left w:val="single" w:color="D9DEDB" w:sz="2"/>
+          <w:bottom w:val="single" w:color="D9DEDB" w:sz="2"/>
+          <w:right w:val="single" w:color="D9DEDB" w:sz="2"/>
+          <w:insideH w:val="single" w:color="D9DEDB" w:sz="2"/>
+          <w:insideV w:val="single" w:color="D9DEDB" w:sz="2"/>
+        </w:tblBorders>
+      </w:tblPr>
+      <w:tblGrid>
+        <w:gridCol w:w="1500"/>
+        <w:gridCol w:w="1400"/>
+        <w:gridCol w:w="900"/>
+        <w:gridCol w:w="2200"/>
+        <w:gridCol w:w="3360"/>
+      </w:tblGrid>
+      <w:tr>
+        <w:trPr>
+          <w:tblHeader/>
+        </w:trPr>
+        <w:tc>
+          <w:tcPr>
+            <w:tcW w:type="dxa" w:w="1500"/>
+            <w:shd w:fill="0E3D33" w:val="clear"/>
+            <w:tcMar>
+              <w:top w:type="dxa" w:w="60"/>
+              <w:left w:type="dxa" w:w="110"/>
+              <w:bottom w:type="dxa" w:w="60"/>
+              <w:right w:type="dxa" w:w="110"/>
+            </w:tcMar>
+          </w:tcPr>
+          <w:p>
+            <w:r>
+              <w:rPr>
+                <w:rFonts w:ascii="Calibri" w:cs="Calibri" w:eastAsia="Calibri" w:hAnsi="Calibri"/>
+                <w:b/>
+                <w:bCs/>
+                <w:color w:val="F0C97A"/>
+                <w:sz w:val="15"/>
+                <w:szCs w:val="15"/>
+              </w:rPr>
+              <w:t xml:space="preserve">WORKER</w:t>
+            </w:r>
+          </w:p>
+        </w:tc>
+        <w:tc>
+          <w:tcPr>
+            <w:tcW w:type="dxa" w:w="1400"/>
+            <w:shd w:fill="0E3D33" w:val="clear"/>
+            <w:tcMar>
+              <w:top w:type="dxa" w:w="60"/>
+              <w:left w:type="dxa" w:w="110"/>
+              <w:bottom w:type="dxa" w:w="60"/>
+              <w:right w:type="dxa" w:w="110"/>
+            </w:tcMar>
+          </w:tcPr>
+          <w:p>
+            <w:r>
+              <w:rPr>
+                <w:rFonts w:ascii="Calibri" w:cs="Calibri" w:eastAsia="Calibri" w:hAnsi="Calibri"/>
+                <w:b/>
+                <w:bCs/>
+                <w:color w:val="F0C97A"/>
+                <w:sz w:val="15"/>
+                <w:szCs w:val="15"/>
+              </w:rPr>
+              <w:t xml:space="preserve">RELIABILITY</w:t>
+            </w:r>
+          </w:p>
+        </w:tc>
+        <w:tc>
+          <w:tcPr>
+            <w:tcW w:type="dxa" w:w="900"/>
+            <w:shd w:fill="0E3D33" w:val="clear"/>
+            <w:tcMar>
+              <w:top w:type="dxa" w:w="60"/>
+              <w:left w:type="dxa" w:w="110"/>
+              <w:bottom w:type="dxa" w:w="60"/>
+              <w:right w:type="dxa" w:w="110"/>
+            </w:tcMar>
+          </w:tcPr>
+          <w:p>
+            <w:r>
+              <w:rPr>
+                <w:rFonts w:ascii="Calibri" w:cs="Calibri" w:eastAsia="Calibri" w:hAnsi="Calibri"/>
+                <w:b/>
+                <w:bCs/>
+                <w:color w:val="F0C97A"/>
+                <w:sz w:val="15"/>
+                <w:szCs w:val="15"/>
+              </w:rPr>
+              <w:t xml:space="preserve">JOBS</w:t>
+            </w:r>
+          </w:p>
+        </w:tc>
+        <w:tc>
+          <w:tcPr>
+            <w:tcW w:type="dxa" w:w="2200"/>
+            <w:shd w:fill="0E3D33" w:val="clear"/>
+            <w:tcMar>
+              <w:top w:type="dxa" w:w="60"/>
+              <w:left w:type="dxa" w:w="110"/>
+              <w:bottom w:type="dxa" w:w="60"/>
+              <w:right w:type="dxa" w:w="110"/>
+            </w:tcMar>
+          </w:tcPr>
+          <w:p>
+            <w:r>
+              <w:rPr>
+                <w:rFonts w:ascii="Calibri" w:cs="Calibri" w:eastAsia="Calibri" w:hAnsi="Calibri"/>
+                <w:b/>
+                <w:bCs/>
+                <w:color w:val="F0C97A"/>
+                <w:sz w:val="15"/>
+                <w:szCs w:val="15"/>
+              </w:rPr>
+              <w:t xml:space="preserve">SLOT</w:t>
+            </w:r>
+          </w:p>
+        </w:tc>
+        <w:tc>
+          <w:tcPr>
+            <w:tcW w:type="dxa" w:w="3360"/>
+            <w:shd w:fill="0E3D33" w:val="clear"/>
+            <w:tcMar>
+              <w:top w:type="dxa" w:w="60"/>
+              <w:left w:type="dxa" w:w="110"/>
+              <w:bottom w:type="dxa" w:w="60"/>
+              <w:right w:type="dxa" w:w="110"/>
+            </w:tcMar>
+          </w:tcPr>
+          <w:p>
+            <w:r>
+              <w:rPr>
+                <w:rFonts w:ascii="Calibri" w:cs="Calibri" w:eastAsia="Calibri" w:hAnsi="Calibri"/>
+                <w:b/>
+                <w:bCs/>
+                <w:color w:val="F0C97A"/>
+                <w:sz w:val="15"/>
+                <w:szCs w:val="15"/>
+              </w:rPr>
+              <w:t xml:space="preserve">ADDS UP TO → BAND</w:t>
+            </w:r>
+          </w:p>
+        </w:tc>
+      </w:tr>
+      <w:tr>
+        <w:tc>
+          <w:tcPr>
+            <w:tcW w:type="dxa" w:w="1500"/>
+            <w:shd w:fill="FFFFFF" w:val="clear"/>
+            <w:tcMar>
+              <w:top w:type="dxa" w:w="50"/>
+              <w:left w:type="dxa" w:w="110"/>
+              <w:bottom w:type="dxa" w:w="50"/>
+              <w:right w:type="dxa" w:w="110"/>
+            </w:tcMar>
+          </w:tcPr>
+          <w:p>
+            <w:r>
+              <w:rPr>
+                <w:rFonts w:ascii="Calibri" w:cs="Calibri" w:eastAsia="Calibri" w:hAnsi="Calibri"/>
+                <w:b/>
+                <w:bCs/>
+                <w:color w:val="12201C"/>
+                <w:sz w:val="21"/>
+                <w:szCs w:val="21"/>
+              </w:rPr>
+              <w:t xml:space="preserve">Meena</w:t>
+            </w:r>
+          </w:p>
+        </w:tc>
+        <w:tc>
+          <w:tcPr>
+            <w:tcW w:type="dxa" w:w="1400"/>
+            <w:shd w:fill="FFFFFF" w:val="clear"/>
+            <w:tcMar>
+              <w:top w:type="dxa" w:w="50"/>
+              <w:left w:type="dxa" w:w="110"/>
+              <w:bottom w:type="dxa" w:w="50"/>
+              <w:right w:type="dxa" w:w="110"/>
+            </w:tcMar>
+          </w:tcPr>
+          <w:p>
+            <w:r>
+              <w:rPr>
+                <w:rFonts w:ascii="Calibri" w:cs="Calibri" w:eastAsia="Calibri" w:hAnsi="Calibri"/>
+                <w:color w:val="2B3A34"/>
+                <w:sz w:val="21"/>
+                <w:szCs w:val="21"/>
+              </w:rPr>
+              <w:t xml:space="preserve">97%</w:t>
+            </w:r>
+          </w:p>
+        </w:tc>
+        <w:tc>
+          <w:tcPr>
+            <w:tcW w:type="dxa" w:w="900"/>
+            <w:shd w:fill="FFFFFF" w:val="clear"/>
+            <w:tcMar>
+              <w:top w:type="dxa" w:w="50"/>
+              <w:left w:type="dxa" w:w="110"/>
+              <w:bottom w:type="dxa" w:w="50"/>
+              <w:right w:type="dxa" w:w="110"/>
+            </w:tcMar>
+          </w:tcPr>
+          <w:p>
+            <w:r>
+              <w:rPr>
+                <w:rFonts w:ascii="Calibri" w:cs="Calibri" w:eastAsia="Calibri" w:hAnsi="Calibri"/>
+                <w:color w:val="2B3A34"/>
+                <w:sz w:val="21"/>
+                <w:szCs w:val="21"/>
+              </w:rPr>
+              <w:t xml:space="preserve">347</w:t>
+            </w:r>
+          </w:p>
+        </w:tc>
+        <w:tc>
+          <w:tcPr>
+            <w:tcW w:type="dxa" w:w="2200"/>
+            <w:shd w:fill="FFFFFF" w:val="clear"/>
+            <w:tcMar>
+              <w:top w:type="dxa" w:w="50"/>
+              <w:left w:type="dxa" w:w="110"/>
+              <w:bottom w:type="dxa" w:w="50"/>
+              <w:right w:type="dxa" w:w="110"/>
+            </w:tcMar>
+          </w:tcPr>
+          <w:p>
+            <w:r>
+              <w:rPr>
+                <w:rFonts w:ascii="Calibri" w:cs="Calibri" w:eastAsia="Calibri" w:hAnsi="Calibri"/>
+                <w:color w:val="2B3A34"/>
+                <w:sz w:val="21"/>
+                <w:szCs w:val="21"/>
+              </w:rPr>
+              <w:t xml:space="preserve">weekday, days out</w:t>
+            </w:r>
+          </w:p>
+        </w:tc>
+        <w:tc>
+          <w:tcPr>
+            <w:tcW w:type="dxa" w:w="3360"/>
+            <w:shd w:fill="FFFFFF" w:val="clear"/>
+            <w:tcMar>
+              <w:top w:type="dxa" w:w="50"/>
+              <w:left w:type="dxa" w:w="110"/>
+              <w:bottom w:type="dxa" w:w="50"/>
+              <w:right w:type="dxa" w:w="110"/>
+            </w:tcMar>
+          </w:tcPr>
+          <w:p>
+            <w:r>
+              <w:rPr>
+                <w:rFonts w:ascii="Calibri" w:cs="Calibri" w:eastAsia="Calibri" w:hAnsi="Calibri"/>
+                <w:color w:val="2B3A34"/>
+                <w:sz w:val="21"/>
+                <w:szCs w:val="21"/>
+              </w:rPr>
+              <w:t xml:space="preserve">0.03  →  </w:t>
+            </w:r>
+            <w:r>
+              <w:rPr>
+                <w:rFonts w:ascii="Calibri" w:cs="Calibri" w:eastAsia="Calibri" w:hAnsi="Calibri"/>
+                <w:b/>
+                <w:bCs/>
+                <w:color w:val="1E8A5A"/>
+                <w:sz w:val="21"/>
+                <w:szCs w:val="21"/>
+              </w:rPr>
+              <w:t xml:space="preserve">5% · Low</w:t>
+            </w:r>
+          </w:p>
+        </w:tc>
+      </w:tr>
+      <w:tr>
+        <w:tc>
+          <w:tcPr>
+            <w:tcW w:type="dxa" w:w="1500"/>
+            <w:shd w:fill="F4F7F5" w:val="clear"/>
+            <w:tcMar>
+              <w:top w:type="dxa" w:w="50"/>
+              <w:left w:type="dxa" w:w="110"/>
+              <w:bottom w:type="dxa" w:w="50"/>
+              <w:right w:type="dxa" w:w="110"/>
+            </w:tcMar>
+          </w:tcPr>
+          <w:p>
+            <w:r>
+              <w:rPr>
+                <w:rFonts w:ascii="Calibri" w:cs="Calibri" w:eastAsia="Calibri" w:hAnsi="Calibri"/>
+                <w:b/>
+                <w:bCs/>
+                <w:color w:val="12201C"/>
+                <w:sz w:val="21"/>
+                <w:szCs w:val="21"/>
+              </w:rPr>
+              <w:t xml:space="preserve">New pro</w:t>
+            </w:r>
+          </w:p>
+        </w:tc>
+        <w:tc>
+          <w:tcPr>
+            <w:tcW w:type="dxa" w:w="1400"/>
+            <w:shd w:fill="F4F7F5" w:val="clear"/>
+            <w:tcMar>
+              <w:top w:type="dxa" w:w="50"/>
+              <w:left w:type="dxa" w:w="110"/>
+              <w:bottom w:type="dxa" w:w="50"/>
+              <w:right w:type="dxa" w:w="110"/>
+            </w:tcMar>
+          </w:tcPr>
+          <w:p>
+            <w:r>
+              <w:rPr>
+                <w:rFonts w:ascii="Calibri" w:cs="Calibri" w:eastAsia="Calibri" w:hAnsi="Calibri"/>
+                <w:color w:val="2B3A34"/>
+                <w:sz w:val="21"/>
+                <w:szCs w:val="21"/>
+              </w:rPr>
+              <w:t xml:space="preserve">72%</w:t>
+            </w:r>
+          </w:p>
+        </w:tc>
+        <w:tc>
+          <w:tcPr>
+            <w:tcW w:type="dxa" w:w="900"/>
+            <w:shd w:fill="F4F7F5" w:val="clear"/>
+            <w:tcMar>
+              <w:top w:type="dxa" w:w="50"/>
+              <w:left w:type="dxa" w:w="110"/>
+              <w:bottom w:type="dxa" w:w="50"/>
+              <w:right w:type="dxa" w:w="110"/>
+            </w:tcMar>
+          </w:tcPr>
+          <w:p>
+            <w:r>
+              <w:rPr>
+                <w:rFonts w:ascii="Calibri" w:cs="Calibri" w:eastAsia="Calibri" w:hAnsi="Calibri"/>
+                <w:color w:val="2B3A34"/>
+                <w:sz w:val="21"/>
+                <w:szCs w:val="21"/>
+              </w:rPr>
+              <w:t xml:space="preserve">8</w:t>
+            </w:r>
+          </w:p>
+        </w:tc>
+        <w:tc>
+          <w:tcPr>
+            <w:tcW w:type="dxa" w:w="2200"/>
+            <w:shd w:fill="F4F7F5" w:val="clear"/>
+            <w:tcMar>
+              <w:top w:type="dxa" w:w="50"/>
+              <w:left w:type="dxa" w:w="110"/>
+              <w:bottom w:type="dxa" w:w="50"/>
+              <w:right w:type="dxa" w:w="110"/>
+            </w:tcMar>
+          </w:tcPr>
+          <w:p>
+            <w:r>
+              <w:rPr>
+                <w:rFonts w:ascii="Calibri" w:cs="Calibri" w:eastAsia="Calibri" w:hAnsi="Calibri"/>
+                <w:color w:val="2B3A34"/>
+                <w:sz w:val="21"/>
+                <w:szCs w:val="21"/>
+              </w:rPr>
+              <w:t xml:space="preserve">Sat, in 2 hours</w:t>
+            </w:r>
+          </w:p>
+        </w:tc>
+        <w:tc>
+          <w:tcPr>
+            <w:tcW w:type="dxa" w:w="3360"/>
+            <w:shd w:fill="F4F7F5" w:val="clear"/>
+            <w:tcMar>
+              <w:top w:type="dxa" w:w="50"/>
+              <w:left w:type="dxa" w:w="110"/>
+              <w:bottom w:type="dxa" w:w="50"/>
+              <w:right w:type="dxa" w:w="110"/>
+            </w:tcMar>
+          </w:tcPr>
+          <w:p>
+            <w:r>
+              <w:rPr>
+                <w:rFonts w:ascii="Calibri" w:cs="Calibri" w:eastAsia="Calibri" w:hAnsi="Calibri"/>
+                <w:color w:val="2B3A34"/>
+                <w:sz w:val="21"/>
+                <w:szCs w:val="21"/>
+              </w:rPr>
+              <w:t xml:space="preserve">0.28 + 0.15 + 0.10 + 0.05  =  </w:t>
+            </w:r>
+            <w:r>
+              <w:rPr>
+                <w:rFonts w:ascii="Calibri" w:cs="Calibri" w:eastAsia="Calibri" w:hAnsi="Calibri"/>
+                <w:b/>
+                <w:bCs/>
+                <w:color w:val="B9791A"/>
+                <w:sz w:val="21"/>
+                <w:szCs w:val="21"/>
+              </w:rPr>
+              <w:t xml:space="preserve">58% · Medium</w:t>
+            </w:r>
+          </w:p>
+        </w:tc>
+      </w:tr>
+      <w:tr>
+        <w:tc>
+          <w:tcPr>
+            <w:tcW w:type="dxa" w:w="1500"/>
+            <w:shd w:fill="FFFFFF" w:val="clear"/>
+            <w:tcMar>
+              <w:top w:type="dxa" w:w="50"/>
+              <w:left w:type="dxa" w:w="110"/>
+              <w:bottom w:type="dxa" w:w="50"/>
+              <w:right w:type="dxa" w:w="110"/>
+            </w:tcMar>
+          </w:tcPr>
+          <w:p>
+            <w:r>
+              <w:rPr>
+                <w:rFonts w:ascii="Calibri" w:cs="Calibri" w:eastAsia="Calibri" w:hAnsi="Calibri"/>
+                <w:b/>
+                <w:bCs/>
+                <w:color w:val="12201C"/>
+                <w:sz w:val="21"/>
+                <w:szCs w:val="21"/>
+              </w:rPr>
+              <w:t xml:space="preserve">Unproven</w:t>
+            </w:r>
+          </w:p>
+        </w:tc>
+        <w:tc>
+          <w:tcPr>
+            <w:tcW w:type="dxa" w:w="1400"/>
+            <w:shd w:fill="FFFFFF" w:val="clear"/>
+            <w:tcMar>
+              <w:top w:type="dxa" w:w="50"/>
+              <w:left w:type="dxa" w:w="110"/>
+              <w:bottom w:type="dxa" w:w="50"/>
+              <w:right w:type="dxa" w:w="110"/>
+            </w:tcMar>
+          </w:tcPr>
+          <w:p>
+            <w:r>
+              <w:rPr>
+                <w:rFonts w:ascii="Calibri" w:cs="Calibri" w:eastAsia="Calibri" w:hAnsi="Calibri"/>
+                <w:color w:val="2B3A34"/>
+                <w:sz w:val="21"/>
+                <w:szCs w:val="21"/>
+              </w:rPr>
+              <w:t xml:space="preserve">50%</w:t>
+            </w:r>
+          </w:p>
+        </w:tc>
+        <w:tc>
+          <w:tcPr>
+            <w:tcW w:type="dxa" w:w="900"/>
+            <w:shd w:fill="FFFFFF" w:val="clear"/>
+            <w:tcMar>
+              <w:top w:type="dxa" w:w="50"/>
+              <w:left w:type="dxa" w:w="110"/>
+              <w:bottom w:type="dxa" w:w="50"/>
+              <w:right w:type="dxa" w:w="110"/>
+            </w:tcMar>
+          </w:tcPr>
+          <w:p>
+            <w:r>
+              <w:rPr>
+                <w:rFonts w:ascii="Calibri" w:cs="Calibri" w:eastAsia="Calibri" w:hAnsi="Calibri"/>
+                <w:color w:val="2B3A34"/>
+                <w:sz w:val="21"/>
+                <w:szCs w:val="21"/>
+              </w:rPr>
+              <w:t xml:space="preserve">3</w:t>
+            </w:r>
+          </w:p>
+        </w:tc>
+        <w:tc>
+          <w:tcPr>
+            <w:tcW w:type="dxa" w:w="2200"/>
+            <w:shd w:fill="FFFFFF" w:val="clear"/>
+            <w:tcMar>
+              <w:top w:type="dxa" w:w="50"/>
+              <w:left w:type="dxa" w:w="110"/>
+              <w:bottom w:type="dxa" w:w="50"/>
+              <w:right w:type="dxa" w:w="110"/>
+            </w:tcMar>
+          </w:tcPr>
+          <w:p>
+            <w:r>
+              <w:rPr>
+                <w:rFonts w:ascii="Calibri" w:cs="Calibri" w:eastAsia="Calibri" w:hAnsi="Calibri"/>
+                <w:color w:val="2B3A34"/>
+                <w:sz w:val="21"/>
+                <w:szCs w:val="21"/>
+              </w:rPr>
+              <w:t xml:space="preserve">Sat, in 1 hour</w:t>
+            </w:r>
+          </w:p>
+        </w:tc>
+        <w:tc>
+          <w:tcPr>
+            <w:tcW w:type="dxa" w:w="3360"/>
+            <w:shd w:fill="FFFFFF" w:val="clear"/>
+            <w:tcMar>
+              <w:top w:type="dxa" w:w="50"/>
+              <w:left w:type="dxa" w:w="110"/>
+              <w:bottom w:type="dxa" w:w="50"/>
+              <w:right w:type="dxa" w:w="110"/>
+            </w:tcMar>
+          </w:tcPr>
+          <w:p>
+            <w:r>
+              <w:rPr>
+                <w:rFonts w:ascii="Calibri" w:cs="Calibri" w:eastAsia="Calibri" w:hAnsi="Calibri"/>
+                <w:color w:val="2B3A34"/>
+                <w:sz w:val="21"/>
+                <w:szCs w:val="21"/>
+              </w:rPr>
+              <w:t xml:space="preserve">0.50 + 0.15 + 0.10 + 0.05  =  </w:t>
+            </w:r>
+            <w:r>
+              <w:rPr>
+                <w:rFonts w:ascii="Calibri" w:cs="Calibri" w:eastAsia="Calibri" w:hAnsi="Calibri"/>
+                <w:b/>
+                <w:bCs/>
+                <w:color w:val="B4442E"/>
+                <w:sz w:val="21"/>
+                <w:szCs w:val="21"/>
+              </w:rPr>
+              <w:t xml:space="preserve">80% · High</w:t>
+            </w:r>
+          </w:p>
+        </w:tc>
+      </w:tr>
+    </w:tbl>
+    <w:p>
+      <w:pPr>
+        <w:spacing w:after="120" w:line="276"/>
+      </w:pPr>
+      <w:r>
+        <w:rPr>
+          <w:rFonts w:ascii="Calibri" w:cs="Calibri" w:eastAsia="Calibri" w:hAnsi="Calibri"/>
+          <w:b/>
+          <w:bCs/>
+          <w:color w:val="12201C"/>
+          <w:sz w:val="21"/>
+          <w:szCs w:val="21"/>
+        </w:rPr>
+        <w:t xml:space="preserve">High is deliberately rare.  </w:t>
+      </w:r>
+      <w:r>
+        <w:rPr>
+          <w:rFonts w:ascii="Calibri" w:cs="Calibri" w:eastAsia="Calibri" w:hAnsi="Calibri"/>
+          <w:color w:val="2B3A34"/>
+          <w:sz w:val="21"/>
+          <w:szCs w:val="21"/>
+        </w:rPr>
+        <w:t xml:space="preserve">It takes a genuinely weak record to cross 70%, so Casai reserves a backup only when the risk is real — it never cries wolf on a dependable worker on a normal slot.</w:t>
+      </w:r>
+    </w:p>
     <w:p>
       <w:pPr>
         <w:pStyle w:val="Heading2"/>
@@ -3093,6 +3817,567 @@
           <w:szCs w:val="24"/>
         </w:rPr>
         <w:t xml:space="preserve">09  </w:t>
+      </w:r>
+      <w:r>
+        <w:rPr>
+          <w:rFonts w:ascii="Calibri" w:cs="Calibri" w:eastAsia="Calibri" w:hAnsi="Calibri"/>
+          <w:b/>
+          <w:bCs/>
+          <w:color w:val="0E3D33"/>
+          <w:sz w:val="24"/>
+          <w:szCs w:val="24"/>
+        </w:rPr>
+        <w:t xml:space="preserve">Edge cases — and how they're handled</w:t>
+      </w:r>
+    </w:p>
+    <w:p>
+      <w:pPr>
+        <w:spacing w:after="120" w:line="276"/>
+      </w:pPr>
+      <w:r>
+        <w:rPr>
+          <w:rFonts w:ascii="Calibri" w:cs="Calibri" w:eastAsia="Calibri" w:hAnsi="Calibri"/>
+          <w:color w:val="2B3A34"/>
+          <w:sz w:val="21"/>
+          <w:szCs w:val="21"/>
+        </w:rPr>
+        <w:t xml:space="preserve">The loop has to cope with messy reality. The ones that matter:</w:t>
+      </w:r>
+    </w:p>
+    <w:tbl>
+      <w:tblPr>
+        <w:tblW w:type="dxa" w:w="9360"/>
+        <w:tblBorders>
+          <w:top w:val="none"/>
+          <w:left w:val="single" w:color="B8860B" w:sz="18"/>
+          <w:bottom w:val="none"/>
+          <w:right w:val="none"/>
+          <w:insideH w:val="none"/>
+          <w:insideV w:val="none"/>
+        </w:tblBorders>
+      </w:tblPr>
+      <w:tblGrid>
+        <w:gridCol w:w="9360"/>
+      </w:tblGrid>
+      <w:tr>
+        <w:tc>
+          <w:tcPr>
+            <w:tcW w:type="dxa" w:w="9360"/>
+            <w:shd w:fill="FBF6EA" w:val="clear"/>
+            <w:tcMar>
+              <w:top w:type="dxa" w:w="90"/>
+              <w:left w:type="dxa" w:w="200"/>
+              <w:bottom w:type="dxa" w:w="90"/>
+              <w:right w:type="dxa" w:w="160"/>
+            </w:tcMar>
+          </w:tcPr>
+          <w:p>
+            <w:r>
+              <w:rPr>
+                <w:rFonts w:ascii="Calibri" w:cs="Calibri" w:eastAsia="Calibri" w:hAnsi="Calibri"/>
+                <w:b/>
+                <w:bCs/>
+                <w:color w:val="12201C"/>
+                <w:sz w:val="21"/>
+                <w:szCs w:val="21"/>
+              </w:rPr>
+              <w:t xml:space="preserve">The big one — timing.  </w:t>
+            </w:r>
+            <w:r>
+              <w:rPr>
+                <w:rFonts w:ascii="Calibri" w:cs="Calibri" w:eastAsia="Calibri" w:hAnsi="Calibri"/>
+                <w:color w:val="2B3A34"/>
+                <w:sz w:val="21"/>
+                <w:szCs w:val="21"/>
+              </w:rPr>
+              <w:t xml:space="preserve">If Casai only notices at 8:00, a backup can't travel in time — the 8:30 school bus and 9:00 meeting are already lost. So the decision is made </w:t>
+            </w:r>
+            <w:r>
+              <w:rPr>
+                <w:rFonts w:ascii="Calibri" w:cs="Calibri" w:eastAsia="Calibri" w:hAnsi="Calibri"/>
+                <w:b/>
+                <w:bCs/>
+                <w:color w:val="12201C"/>
+                <w:sz w:val="21"/>
+                <w:szCs w:val="21"/>
+              </w:rPr>
+              <w:t xml:space="preserve">earlier</w:t>
+            </w:r>
+            <w:r>
+              <w:rPr>
+                <w:rFonts w:ascii="Calibri" w:cs="Calibri" w:eastAsia="Calibri" w:hAnsi="Calibri"/>
+                <w:color w:val="2B3A34"/>
+                <w:sz w:val="21"/>
+                <w:szCs w:val="21"/>
+              </w:rPr>
+              <w:t xml:space="preserve">: the slot time is the deadline for the backup to be at the door, not the moment to start looking. Casai re-checks the risk 60–90 minutes ahead, asks the worker to confirm they're coming, and sends a backup travelling early when the risk stays high — so the backup checks in </w:t>
+            </w:r>
+            <w:r>
+              <w:rPr>
+                <w:rFonts w:ascii="Calibri" w:cs="Calibri" w:eastAsia="Calibri" w:hAnsi="Calibri"/>
+                <w:b/>
+                <w:bCs/>
+                <w:color w:val="12201C"/>
+                <w:sz w:val="21"/>
+                <w:szCs w:val="21"/>
+              </w:rPr>
+              <w:t xml:space="preserve">at 8:00, not after</w:t>
+            </w:r>
+            <w:r>
+              <w:rPr>
+                <w:rFonts w:ascii="Calibri" w:cs="Calibri" w:eastAsia="Calibri" w:hAnsi="Calibri"/>
+                <w:color w:val="2B3A34"/>
+                <w:sz w:val="21"/>
+                <w:szCs w:val="21"/>
+              </w:rPr>
+              <w:t xml:space="preserve">.</w:t>
+            </w:r>
+          </w:p>
+        </w:tc>
+      </w:tr>
+    </w:tbl>
+    <w:p>
+      <w:pPr>
+        <w:spacing w:after="30"/>
+      </w:pPr>
+    </w:p>
+    <w:tbl>
+      <w:tblPr>
+        <w:tblW w:type="dxa" w:w="9360"/>
+        <w:tblBorders>
+          <w:top w:val="single" w:color="D9DEDB" w:sz="2"/>
+          <w:left w:val="single" w:color="D9DEDB" w:sz="2"/>
+          <w:bottom w:val="single" w:color="D9DEDB" w:sz="2"/>
+          <w:right w:val="single" w:color="D9DEDB" w:sz="2"/>
+          <w:insideH w:val="single" w:color="D9DEDB" w:sz="2"/>
+          <w:insideV w:val="single" w:color="D9DEDB" w:sz="2"/>
+        </w:tblBorders>
+      </w:tblPr>
+      <w:tblGrid>
+        <w:gridCol w:w="3400"/>
+        <w:gridCol w:w="5960"/>
+      </w:tblGrid>
+      <w:tr>
+        <w:trPr>
+          <w:tblHeader/>
+        </w:trPr>
+        <w:tc>
+          <w:tcPr>
+            <w:tcW w:type="dxa" w:w="3400"/>
+            <w:shd w:fill="0E3D33" w:val="clear"/>
+            <w:tcMar>
+              <w:top w:type="dxa" w:w="60"/>
+              <w:left w:type="dxa" w:w="110"/>
+              <w:bottom w:type="dxa" w:w="60"/>
+              <w:right w:type="dxa" w:w="110"/>
+            </w:tcMar>
+          </w:tcPr>
+          <w:p>
+            <w:r>
+              <w:rPr>
+                <w:rFonts w:ascii="Calibri" w:cs="Calibri" w:eastAsia="Calibri" w:hAnsi="Calibri"/>
+                <w:b/>
+                <w:bCs/>
+                <w:color w:val="F0C97A"/>
+                <w:sz w:val="15"/>
+                <w:szCs w:val="15"/>
+              </w:rPr>
+              <w:t xml:space="preserve">SITUATION</w:t>
+            </w:r>
+          </w:p>
+        </w:tc>
+        <w:tc>
+          <w:tcPr>
+            <w:tcW w:type="dxa" w:w="5960"/>
+            <w:shd w:fill="0E3D33" w:val="clear"/>
+            <w:tcMar>
+              <w:top w:type="dxa" w:w="60"/>
+              <w:left w:type="dxa" w:w="110"/>
+              <w:bottom w:type="dxa" w:w="60"/>
+              <w:right w:type="dxa" w:w="110"/>
+            </w:tcMar>
+          </w:tcPr>
+          <w:p>
+            <w:r>
+              <w:rPr>
+                <w:rFonts w:ascii="Calibri" w:cs="Calibri" w:eastAsia="Calibri" w:hAnsi="Calibri"/>
+                <w:b/>
+                <w:bCs/>
+                <w:color w:val="F0C97A"/>
+                <w:sz w:val="15"/>
+                <w:szCs w:val="15"/>
+              </w:rPr>
+              <w:t xml:space="preserve">WHAT CASAI DOES</w:t>
+            </w:r>
+          </w:p>
+        </w:tc>
+      </w:tr>
+      <w:tr>
+        <w:tc>
+          <w:tcPr>
+            <w:tcW w:type="dxa" w:w="3400"/>
+            <w:shd w:fill="FFFFFF" w:val="clear"/>
+            <w:tcMar>
+              <w:top w:type="dxa" w:w="50"/>
+              <w:left w:type="dxa" w:w="110"/>
+              <w:bottom w:type="dxa" w:w="50"/>
+              <w:right w:type="dxa" w:w="110"/>
+            </w:tcMar>
+          </w:tcPr>
+          <w:p>
+            <w:r>
+              <w:rPr>
+                <w:rFonts w:ascii="Calibri" w:cs="Calibri" w:eastAsia="Calibri" w:hAnsi="Calibri"/>
+                <w:b/>
+                <w:bCs/>
+                <w:color w:val="12201C"/>
+                <w:sz w:val="21"/>
+                <w:szCs w:val="21"/>
+              </w:rPr>
+              <w:t xml:space="preserve">Worker only goes silent at the slot</w:t>
+            </w:r>
+          </w:p>
+        </w:tc>
+        <w:tc>
+          <w:tcPr>
+            <w:tcW w:type="dxa" w:w="5960"/>
+            <w:shd w:fill="FFFFFF" w:val="clear"/>
+            <w:tcMar>
+              <w:top w:type="dxa" w:w="50"/>
+              <w:left w:type="dxa" w:w="110"/>
+              <w:bottom w:type="dxa" w:w="50"/>
+              <w:right w:type="dxa" w:w="110"/>
+            </w:tcMar>
+          </w:tcPr>
+          <w:p>
+            <w:r>
+              <w:rPr>
+                <w:rFonts w:ascii="Calibri" w:cs="Calibri" w:eastAsia="Calibri" w:hAnsi="Calibri"/>
+                <w:color w:val="2B3A34"/>
+                <w:sz w:val="21"/>
+                <w:szCs w:val="21"/>
+              </w:rPr>
+              <w:t xml:space="preserve">Don't wait for it. Re-score and ask the worker to confirm 60–90 min ahead; if risk is High and they haven't confirmed, the backup travels early so it arrives on time.</w:t>
+            </w:r>
+          </w:p>
+        </w:tc>
+      </w:tr>
+      <w:tr>
+        <w:tc>
+          <w:tcPr>
+            <w:tcW w:type="dxa" w:w="3400"/>
+            <w:shd w:fill="F4F7F5" w:val="clear"/>
+            <w:tcMar>
+              <w:top w:type="dxa" w:w="50"/>
+              <w:left w:type="dxa" w:w="110"/>
+              <w:bottom w:type="dxa" w:w="50"/>
+              <w:right w:type="dxa" w:w="110"/>
+            </w:tcMar>
+          </w:tcPr>
+          <w:p>
+            <w:r>
+              <w:rPr>
+                <w:rFonts w:ascii="Calibri" w:cs="Calibri" w:eastAsia="Calibri" w:hAnsi="Calibri"/>
+                <w:b/>
+                <w:bCs/>
+                <w:color w:val="12201C"/>
+                <w:sz w:val="21"/>
+                <w:szCs w:val="21"/>
+              </w:rPr>
+              <w:t xml:space="preserve">No backup is free at that slot</w:t>
+            </w:r>
+          </w:p>
+        </w:tc>
+        <w:tc>
+          <w:tcPr>
+            <w:tcW w:type="dxa" w:w="5960"/>
+            <w:shd w:fill="F4F7F5" w:val="clear"/>
+            <w:tcMar>
+              <w:top w:type="dxa" w:w="50"/>
+              <w:left w:type="dxa" w:w="110"/>
+              <w:bottom w:type="dxa" w:w="50"/>
+              <w:right w:type="dxa" w:w="110"/>
+            </w:tcMar>
+          </w:tcPr>
+          <w:p>
+            <w:r>
+              <w:rPr>
+                <w:rFonts w:ascii="Calibri" w:cs="Calibri" w:eastAsia="Calibri" w:hAnsi="Calibri"/>
+                <w:color w:val="2B3A34"/>
+                <w:sz w:val="21"/>
+                <w:szCs w:val="21"/>
+              </w:rPr>
+              <w:t xml:space="preserve">Say so honestly and early. Widen the search to nearby areas, or offer the household a reschedule or credit — never pretend cover exists.</w:t>
+            </w:r>
+          </w:p>
+        </w:tc>
+      </w:tr>
+      <w:tr>
+        <w:tc>
+          <w:tcPr>
+            <w:tcW w:type="dxa" w:w="3400"/>
+            <w:shd w:fill="FFFFFF" w:val="clear"/>
+            <w:tcMar>
+              <w:top w:type="dxa" w:w="50"/>
+              <w:left w:type="dxa" w:w="110"/>
+              <w:bottom w:type="dxa" w:w="50"/>
+              <w:right w:type="dxa" w:w="110"/>
+            </w:tcMar>
+          </w:tcPr>
+          <w:p>
+            <w:r>
+              <w:rPr>
+                <w:rFonts w:ascii="Calibri" w:cs="Calibri" w:eastAsia="Calibri" w:hAnsi="Calibri"/>
+                <w:b/>
+                <w:bCs/>
+                <w:color w:val="12201C"/>
+                <w:sz w:val="21"/>
+                <w:szCs w:val="21"/>
+              </w:rPr>
+              <w:t xml:space="preserve">Worker turns up after the backup was sent</w:t>
+            </w:r>
+          </w:p>
+        </w:tc>
+        <w:tc>
+          <w:tcPr>
+            <w:tcW w:type="dxa" w:w="5960"/>
+            <w:shd w:fill="FFFFFF" w:val="clear"/>
+            <w:tcMar>
+              <w:top w:type="dxa" w:w="50"/>
+              <w:left w:type="dxa" w:w="110"/>
+              <w:bottom w:type="dxa" w:w="50"/>
+              <w:right w:type="dxa" w:w="110"/>
+            </w:tcMar>
+          </w:tcPr>
+          <w:p>
+            <w:r>
+              <w:rPr>
+                <w:rFonts w:ascii="Calibri" w:cs="Calibri" w:eastAsia="Calibri" w:hAnsi="Calibri"/>
+                <w:color w:val="2B3A34"/>
+                <w:sz w:val="21"/>
+                <w:szCs w:val="21"/>
+              </w:rPr>
+              <w:t xml:space="preserve">The backup is stood down; the household is covered either way. There's a small standby cost — which is why sending one early is reserved for High-risk (and premium) bookings.</w:t>
+            </w:r>
+          </w:p>
+        </w:tc>
+      </w:tr>
+      <w:tr>
+        <w:tc>
+          <w:tcPr>
+            <w:tcW w:type="dxa" w:w="3400"/>
+            <w:shd w:fill="F4F7F5" w:val="clear"/>
+            <w:tcMar>
+              <w:top w:type="dxa" w:w="50"/>
+              <w:left w:type="dxa" w:w="110"/>
+              <w:bottom w:type="dxa" w:w="50"/>
+              <w:right w:type="dxa" w:w="110"/>
+            </w:tcMar>
+          </w:tcPr>
+          <w:p>
+            <w:r>
+              <w:rPr>
+                <w:rFonts w:ascii="Calibri" w:cs="Calibri" w:eastAsia="Calibri" w:hAnsi="Calibri"/>
+                <w:b/>
+                <w:bCs/>
+                <w:color w:val="12201C"/>
+                <w:sz w:val="21"/>
+                <w:szCs w:val="21"/>
+              </w:rPr>
+              <w:t xml:space="preserve">A Low/Medium worker no-shows anyway</w:t>
+            </w:r>
+          </w:p>
+        </w:tc>
+        <w:tc>
+          <w:tcPr>
+            <w:tcW w:type="dxa" w:w="5960"/>
+            <w:shd w:fill="F4F7F5" w:val="clear"/>
+            <w:tcMar>
+              <w:top w:type="dxa" w:w="50"/>
+              <w:left w:type="dxa" w:w="110"/>
+              <w:bottom w:type="dxa" w:w="50"/>
+              <w:right w:type="dxa" w:w="110"/>
+            </w:tcMar>
+          </w:tcPr>
+          <w:p>
+            <w:r>
+              <w:rPr>
+                <w:rFonts w:ascii="Calibri" w:cs="Calibri" w:eastAsia="Calibri" w:hAnsi="Calibri"/>
+                <w:color w:val="2B3A34"/>
+                <w:sz w:val="21"/>
+                <w:szCs w:val="21"/>
+              </w:rPr>
+              <w:t xml:space="preserve">The miss we didn't predict. The early “are you coming?” check catches many; a thin per-area standby covers the rest — and every such miss becomes data that sharpens the score.</w:t>
+            </w:r>
+          </w:p>
+        </w:tc>
+      </w:tr>
+      <w:tr>
+        <w:tc>
+          <w:tcPr>
+            <w:tcW w:type="dxa" w:w="3400"/>
+            <w:shd w:fill="FFFFFF" w:val="clear"/>
+            <w:tcMar>
+              <w:top w:type="dxa" w:w="50"/>
+              <w:left w:type="dxa" w:w="110"/>
+              <w:bottom w:type="dxa" w:w="50"/>
+              <w:right w:type="dxa" w:w="110"/>
+            </w:tcMar>
+          </w:tcPr>
+          <w:p>
+            <w:r>
+              <w:rPr>
+                <w:rFonts w:ascii="Calibri" w:cs="Calibri" w:eastAsia="Calibri" w:hAnsi="Calibri"/>
+                <w:b/>
+                <w:bCs/>
+                <w:color w:val="12201C"/>
+                <w:sz w:val="21"/>
+                <w:szCs w:val="21"/>
+              </w:rPr>
+              <w:t xml:space="preserve">Both the worker and the backup fail</w:t>
+            </w:r>
+          </w:p>
+        </w:tc>
+        <w:tc>
+          <w:tcPr>
+            <w:tcW w:type="dxa" w:w="5960"/>
+            <w:shd w:fill="FFFFFF" w:val="clear"/>
+            <w:tcMar>
+              <w:top w:type="dxa" w:w="50"/>
+              <w:left w:type="dxa" w:w="110"/>
+              <w:bottom w:type="dxa" w:w="50"/>
+              <w:right w:type="dxa" w:w="110"/>
+            </w:tcMar>
+          </w:tcPr>
+          <w:p>
+            <w:r>
+              <w:rPr>
+                <w:rFonts w:ascii="Calibri" w:cs="Calibri" w:eastAsia="Calibri" w:hAnsi="Calibri"/>
+                <w:color w:val="2B3A34"/>
+                <w:sz w:val="21"/>
+                <w:szCs w:val="21"/>
+              </w:rPr>
+              <w:t xml:space="preserve">Escalate to the next-best worker and to the ops team; the household is notified and credited under the response guarantee.</w:t>
+            </w:r>
+          </w:p>
+        </w:tc>
+      </w:tr>
+      <w:tr>
+        <w:tc>
+          <w:tcPr>
+            <w:tcW w:type="dxa" w:w="3400"/>
+            <w:shd w:fill="F4F7F5" w:val="clear"/>
+            <w:tcMar>
+              <w:top w:type="dxa" w:w="50"/>
+              <w:left w:type="dxa" w:w="110"/>
+              <w:bottom w:type="dxa" w:w="50"/>
+              <w:right w:type="dxa" w:w="110"/>
+            </w:tcMar>
+          </w:tcPr>
+          <w:p>
+            <w:r>
+              <w:rPr>
+                <w:rFonts w:ascii="Calibri" w:cs="Calibri" w:eastAsia="Calibri" w:hAnsi="Calibri"/>
+                <w:b/>
+                <w:bCs/>
+                <w:color w:val="12201C"/>
+                <w:sz w:val="21"/>
+                <w:szCs w:val="21"/>
+              </w:rPr>
+              <w:t xml:space="preserve">Booking is too soon to pre-position</w:t>
+            </w:r>
+          </w:p>
+        </w:tc>
+        <w:tc>
+          <w:tcPr>
+            <w:tcW w:type="dxa" w:w="5960"/>
+            <w:shd w:fill="F4F7F5" w:val="clear"/>
+            <w:tcMar>
+              <w:top w:type="dxa" w:w="50"/>
+              <w:left w:type="dxa" w:w="110"/>
+              <w:bottom w:type="dxa" w:w="50"/>
+              <w:right w:type="dxa" w:w="110"/>
+            </w:tcMar>
+          </w:tcPr>
+          <w:p>
+            <w:r>
+              <w:rPr>
+                <w:rFonts w:ascii="Calibri" w:cs="Calibri" w:eastAsia="Calibri" w:hAnsi="Calibri"/>
+                <w:color w:val="2B3A34"/>
+                <w:sz w:val="21"/>
+                <w:szCs w:val="21"/>
+              </w:rPr>
+              <w:t xml:space="preserve">If there isn't lead time to get anyone there, be honest: offer the fastest available worker and set expectations, rather than promise cover that can't arrive.</w:t>
+            </w:r>
+          </w:p>
+        </w:tc>
+      </w:tr>
+      <w:tr>
+        <w:tc>
+          <w:tcPr>
+            <w:tcW w:type="dxa" w:w="3400"/>
+            <w:shd w:fill="FFFFFF" w:val="clear"/>
+            <w:tcMar>
+              <w:top w:type="dxa" w:w="50"/>
+              <w:left w:type="dxa" w:w="110"/>
+              <w:bottom w:type="dxa" w:w="50"/>
+              <w:right w:type="dxa" w:w="110"/>
+            </w:tcMar>
+          </w:tcPr>
+          <w:p>
+            <w:r>
+              <w:rPr>
+                <w:rFonts w:ascii="Calibri" w:cs="Calibri" w:eastAsia="Calibri" w:hAnsi="Calibri"/>
+                <w:b/>
+                <w:bCs/>
+                <w:color w:val="12201C"/>
+                <w:sz w:val="21"/>
+                <w:szCs w:val="21"/>
+              </w:rPr>
+              <w:t xml:space="preserve">Brand-new worker, no history</w:t>
+            </w:r>
+          </w:p>
+        </w:tc>
+        <w:tc>
+          <w:tcPr>
+            <w:tcW w:type="dxa" w:w="5960"/>
+            <w:shd w:fill="FFFFFF" w:val="clear"/>
+            <w:tcMar>
+              <w:top w:type="dxa" w:w="50"/>
+              <w:left w:type="dxa" w:w="110"/>
+              <w:bottom w:type="dxa" w:w="50"/>
+              <w:right w:type="dxa" w:w="110"/>
+            </w:tcMar>
+          </w:tcPr>
+          <w:p>
+            <w:r>
+              <w:rPr>
+                <w:rFonts w:ascii="Calibri" w:cs="Calibri" w:eastAsia="Calibri" w:hAnsi="Calibri"/>
+                <w:color w:val="2B3A34"/>
+                <w:sz w:val="21"/>
+                <w:szCs w:val="21"/>
+              </w:rPr>
+              <w:t xml:space="preserve">Scored at a cautious 35%, so they're neither assumed perfect nor unfairly condemned. Their real score builds as they complete jobs.</w:t>
+            </w:r>
+          </w:p>
+        </w:tc>
+      </w:tr>
+    </w:tbl>
+    <w:p>
+      <w:pPr>
+        <w:pStyle w:val="Heading2"/>
+        <w:spacing w:after="100" w:before="340"/>
+      </w:pPr>
+      <w:r>
+        <w:rPr>
+          <w:rFonts w:ascii="Calibri" w:cs="Calibri" w:eastAsia="Calibri" w:hAnsi="Calibri"/>
+          <w:b/>
+          <w:bCs/>
+          <w:color w:val="B8860B"/>
+          <w:sz w:val="24"/>
+          <w:szCs w:val="24"/>
+        </w:rPr>
+        <w:t xml:space="preserve">10  </w:t>
       </w:r>
       <w:r>
         <w:rPr>

</xml_diff>